<commit_message>
Nouvel exercice COL (Comparator et Comparable)
</commit_message>
<xml_diff>
--- a/_support/supports_par_modules/Couleur/Support_COL.docx
+++ b/_support/supports_par_modules/Couleur/Support_COL.docx
@@ -9691,6 +9691,173 @@
         </w:rPr>
         <w:t xml:space="preserve">La question qui tranche : l'ordre appartient-il à la classe, ou à l'usage qu'on en fait ? Les deux coexistent sans problème : une classe peut avoir son ordre naturel, et des comparateurs pour les autres besoins.</w:t>
       </w:r>
+    </w:p>
+    <w:tbl>
+      <w:tblPr>
+        <w:tblW w:type="dxa" w:w="9360"/>
+        <w:tblBorders>
+          <w:top w:val="single" w:color="A6A6A6" w:sz="2"/>
+          <w:left w:val="single" w:color="2E7D32" w:sz="12"/>
+          <w:bottom w:val="single" w:color="A6A6A6" w:sz="2"/>
+          <w:right w:val="single" w:color="A6A6A6" w:sz="2"/>
+          <w:insideH w:val="none"/>
+          <w:insideV w:val="none"/>
+        </w:tblBorders>
+      </w:tblPr>
+      <w:tblGrid>
+        <w:gridCol w:w="9360"/>
+      </w:tblGrid>
+      <w:tr>
+        <w:trPr>
+          <w:cantSplit/>
+        </w:trPr>
+        <w:tc>
+          <w:tcPr>
+            <w:tcW w:type="dxa" w:w="9360"/>
+            <w:shd w:fill="F7F9FC" w:val="clear"/>
+            <w:tcMar>
+              <w:top w:type="dxa" w:w="120"/>
+              <w:left w:type="dxa" w:w="160"/>
+              <w:bottom w:type="dxa" w:w="120"/>
+              <w:right w:type="dxa" w:w="160"/>
+            </w:tcMar>
+          </w:tcPr>
+          <w:p>
+            <w:pPr>
+              <w:spacing w:after="80"/>
+            </w:pPr>
+            <w:r>
+              <w:rPr>
+                <w:b/>
+                <w:bCs/>
+                <w:sz w:val="22"/>
+                <w:szCs w:val="22"/>
+              </w:rPr>
+              <w:t xml:space="preserve">Exercices</w:t>
+            </w:r>
+            <w:r>
+              <w:rPr>
+                <w:sz w:val="22"/>
+                <w:szCs w:val="22"/>
+              </w:rPr>
+              <w:t xml:space="preserve"> - </w:t>
+            </w:r>
+            <w:r>
+              <w:rPr>
+                <w:rFonts w:ascii="Consolas" w:hAnsi="Consolas" w:cs="Consolas"/>
+                <w:color w:val="E97132" w:themeColor="accent2"/>
+                <w:sz w:val="18"/>
+                <w:szCs w:val="18"/>
+              </w:rPr>
+              <w:t xml:space="preserve">COL.8</w:t>
+            </w:r>
+            <w:r>
+              <w:rPr>
+                <w:sz w:val="22"/>
+                <w:szCs w:val="22"/>
+              </w:rPr>
+              <w:t xml:space="preserve"> Trois ordres pour une bibliothèque</w:t>
+            </w:r>
+          </w:p>
+          <w:p>
+            <w:pPr>
+              <w:spacing w:after="0"/>
+            </w:pPr>
+            <w:r>
+              <w:rPr>
+                <w:sz w:val="22"/>
+                <w:szCs w:val="22"/>
+              </w:rPr>
+              <w:t xml:space="preserve">L'exercice met en pratique toute la section : un record </w:t>
+            </w:r>
+            <w:r>
+              <w:rPr>
+                <w:rFonts w:ascii="Consolas" w:hAnsi="Consolas" w:cs="Consolas"/>
+                <w:color w:val="E97132" w:themeColor="accent2"/>
+                <w:sz w:val="18"/>
+                <w:szCs w:val="18"/>
+              </w:rPr>
+              <w:t xml:space="preserve">Livre</w:t>
+            </w:r>
+            <w:r>
+              <w:rPr>
+                <w:sz w:val="22"/>
+                <w:szCs w:val="22"/>
+              </w:rPr>
+              <w:t xml:space="preserve"> qui reçoit son ordre naturel par </w:t>
+            </w:r>
+            <w:r>
+              <w:rPr>
+                <w:rFonts w:ascii="Consolas" w:hAnsi="Consolas" w:cs="Consolas"/>
+                <w:color w:val="E97132" w:themeColor="accent2"/>
+                <w:sz w:val="18"/>
+                <w:szCs w:val="18"/>
+              </w:rPr>
+              <w:t xml:space="preserve">compareTo</w:t>
+            </w:r>
+            <w:r>
+              <w:rPr>
+                <w:sz w:val="22"/>
+                <w:szCs w:val="22"/>
+              </w:rPr>
+              <w:t xml:space="preserve">, deux comparateurs pour les autres ordres, et trois méthodes qui trient une copie de la liste. Pour les années, </w:t>
+            </w:r>
+            <w:r>
+              <w:rPr>
+                <w:rFonts w:ascii="Consolas" w:hAnsi="Consolas" w:cs="Consolas"/>
+                <w:color w:val="E97132" w:themeColor="accent2"/>
+                <w:sz w:val="18"/>
+                <w:szCs w:val="18"/>
+              </w:rPr>
+              <w:t xml:space="preserve">Integer.compare</w:t>
+            </w:r>
+            <w:r>
+              <w:rPr>
+                <w:sz w:val="22"/>
+                <w:szCs w:val="22"/>
+              </w:rPr>
+              <w:t xml:space="preserve">, jamais une soustraction. Faites l'expérience de la première question : retirez le titre du comparateur par auteur, et comptez les livres qui restent dans le </w:t>
+            </w:r>
+            <w:r>
+              <w:rPr>
+                <w:rFonts w:ascii="Consolas" w:hAnsi="Consolas" w:cs="Consolas"/>
+                <w:color w:val="E97132" w:themeColor="accent2"/>
+                <w:sz w:val="18"/>
+                <w:szCs w:val="18"/>
+              </w:rPr>
+              <w:t xml:space="preserve">TreeSet</w:t>
+            </w:r>
+            <w:r>
+              <w:rPr>
+                <w:sz w:val="22"/>
+                <w:szCs w:val="22"/>
+              </w:rPr>
+              <w:t xml:space="preserve">. Un comparateur ne dit pas seulement dans quel ordre ranger : pour un </w:t>
+            </w:r>
+            <w:r>
+              <w:rPr>
+                <w:rFonts w:ascii="Consolas" w:hAnsi="Consolas" w:cs="Consolas"/>
+                <w:color w:val="E97132" w:themeColor="accent2"/>
+                <w:sz w:val="18"/>
+                <w:szCs w:val="18"/>
+              </w:rPr>
+              <w:t xml:space="preserve">TreeSet</w:t>
+            </w:r>
+            <w:r>
+              <w:rPr>
+                <w:sz w:val="22"/>
+                <w:szCs w:val="22"/>
+              </w:rPr>
+              <w:t xml:space="preserve">, il dit aussi ce qui est un doublon.</w:t>
+            </w:r>
+          </w:p>
+        </w:tc>
+      </w:tr>
+    </w:tbl>
+    <w:p>
+      <w:pPr>
+        <w:spacing w:after="60"/>
+      </w:pPr>
     </w:p>
     <w:p>
       <w:pPr>
@@ -14283,7 +14450,7 @@
       <w:fldChar w:fldCharType="separate"/>
     </w:r>
     <w:r>
-      <w:t>14</w:t>
+      <w:t>15</w:t>
     </w:r>
     <w:r>
       <w:fldChar w:fldCharType="end"/>

</xml_diff>